<commit_message>
Aula 9: atualiza apostila e slides
</commit_message>
<xml_diff>
--- a/Aula 09 - 15-10-2026/Aula 9 - Apostila do Aluno.docx
+++ b/Aula 09 - 15-10-2026/Aula 9 - Apostila do Aluno.docx
@@ -34,7 +34,7 @@
         <w:rPr>
           <w:sz w:val="21"/>
         </w:rPr>
-        <w:t>Data: 15/10/2026 (quinta-feira)  |  Horário: 07:30 às 11:30 (4h)</w:t>
+        <w:t>Data: 15/10/2026 (quinta-feira)  |  Horário: 07:30 às 10:55</w:t>
       </w:r>
     </w:p>
     <w:p>
@@ -90,6 +90,14 @@
         <w:pStyle w:val="ListBullet"/>
       </w:pPr>
       <w:r>
+        <w:t>Revisar os conceitos principais de cada diagrama a partir do resultado do exemplo guiado.</w:t>
+      </w:r>
+    </w:p>
+    <w:p>
+      <w:pPr>
+        <w:pStyle w:val="ListBullet"/>
+      </w:pPr>
+      <w:r>
         <w:t>Modelar, em grupo e contra o relógio, a EcoBike nos 4 diagramas (Atividade 1).</w:t>
       </w:r>
     </w:p>
@@ -98,23 +106,7 @@
         <w:pStyle w:val="ListBullet"/>
       </w:pPr>
       <w:r>
-        <w:t>Montar, individualmente, a matriz de rastreabilidade da EcoBike e encontrar uma lacuna (Atividade 2).</w:t>
-      </w:r>
-    </w:p>
-    <w:p>
-      <w:pPr>
-        <w:pStyle w:val="ListBullet"/>
-      </w:pPr>
-      <w:r>
         <w:t>Encontrar incoerências entre um diagrama de classes e um de sequência.</w:t>
-      </w:r>
-    </w:p>
-    <w:p>
-      <w:pPr>
-        <w:pStyle w:val="ListBullet"/>
-      </w:pPr>
-      <w:r>
-        <w:t>Revisar, em duplas, tudo o que foi visto nas Aulas 1 a 9 aplicando ao cenário ParkFácil (Atividade 3).</w:t>
       </w:r>
     </w:p>
     <w:p>
@@ -164,7 +156,7 @@
       <w:r>
         <w:drawing>
           <wp:inline xmlns:a="http://schemas.openxmlformats.org/drawingml/2006/main" xmlns:pic="http://schemas.openxmlformats.org/drawingml/2006/picture">
-            <wp:extent cx="5669280" cy="3693208"/>
+            <wp:extent cx="5669280" cy="3686057"/>
             <wp:docPr id="1" name="Picture 1"/>
             <wp:cNvGraphicFramePr>
               <a:graphicFrameLocks noChangeAspect="1"/>
@@ -191,7 +183,7 @@
                   <pic:spPr>
                     <a:xfrm>
                       <a:off x="0" y="0"/>
-                      <a:ext cx="5669280" cy="3693208"/>
+                      <a:ext cx="5669280" cy="3686057"/>
                     </a:xfrm>
                     <a:prstGeom prst="rect"/>
                   </pic:spPr>
@@ -1271,7 +1263,7 @@
       <w:r>
         <w:drawing>
           <wp:inline xmlns:a="http://schemas.openxmlformats.org/drawingml/2006/main" xmlns:pic="http://schemas.openxmlformats.org/drawingml/2006/picture">
-            <wp:extent cx="5852160" cy="1548459"/>
+            <wp:extent cx="5852160" cy="1487482"/>
             <wp:docPr id="2" name="Picture 2"/>
             <wp:cNvGraphicFramePr>
               <a:graphicFrameLocks noChangeAspect="1"/>
@@ -1298,7 +1290,7 @@
                   <pic:spPr>
                     <a:xfrm>
                       <a:off x="0" y="0"/>
-                      <a:ext cx="5852160" cy="1548459"/>
+                      <a:ext cx="5852160" cy="1487482"/>
                     </a:xfrm>
                     <a:prstGeom prst="rect"/>
                   </pic:spPr>
@@ -2677,7 +2669,7 @@
         <w:rPr>
           <w:i w:val="0"/>
         </w:rPr>
-        <w:t>Vamos construir juntos, ao vivo, no draw.io, o que acontece quando o cliente traz uma regra NOVA. A gerente Fernanda quer que o combo grátis do programa de fidelidade possa ser resgatado pelo app:</w:t>
+        <w:t>Vamos construir juntos, ao vivo, no draw.io, o que acontece quando o cliente traz uma regra NOVA. Hoje, pela Regra 2 da Aula 1, ao chegar a 100 pontos o cliente ganha o combo grátis AUTOMATICAMENTE na próxima compra, e os pontos são zerados. A gerente Fernanda quer mudar isso:</w:t>
       </w:r>
     </w:p>
     <w:p>
@@ -2685,7 +2677,7 @@
         <w:pStyle w:val="ListBullet"/>
       </w:pPr>
       <w:r>
-        <w:t>O cliente resgata o combo grátis no carrinho, ao fazer um pedido pelo app.</w:t>
+        <w:t>O cliente escolhe QUANDO resgatar o combo grátis: no carrinho, ao fazer um pedido pelo app.</w:t>
       </w:r>
     </w:p>
     <w:p>
@@ -2693,7 +2685,7 @@
         <w:pStyle w:val="ListBullet"/>
       </w:pPr>
       <w:r>
-        <w:t>Só resgata quem tem 100 pontos ou mais; o resgate zera os pontos (Regra 2 da Aula 1).</w:t>
+        <w:t>Continua valendo: só resgata quem tem 100 pontos ou mais, e o resgate zera os pontos.</w:t>
       </w:r>
     </w:p>
     <w:p>
@@ -2709,7 +2701,7 @@
         <w:rPr>
           <w:i w:val="0"/>
         </w:rPr>
-        <w:t>A pergunta é: o que muda em cada um dos 4 diagramas?</w:t>
+        <w:t>A pergunta é: o que muda em cada um dos 4 diagramas? Vamos responder em 8 passos (slides 48 a 55: em cada um, o que entra no diagrama aparece em laranja).</w:t>
       </w:r>
     </w:p>
     <w:p>
@@ -2722,37 +2714,42 @@
     </w:p>
     <w:p>
       <w:r>
-        <w:t>1.  Casos de uso: Resgatar Combo Grátis JÁ existe desde a Aula 4, ligado ao ator Cliente — nada muda.</w:t>
+        <w:t>Passo 0 — Ponto de partida: abram o “Aula 9 - Exemplo Guiado (ponto de partida).drawio”. A página Atividades já tem as raias Cliente e Sistema; a página Sequência já tem o boneco Cliente, :App, :Pedido e :Cliente.</w:t>
       </w:r>
     </w:p>
     <w:p>
       <w:r>
-        <w:t>2.  Classes: a regra nova vira método do Pedido → + temComboGratis(): Booleano (verdadeiro se o pedido já tem um combo grátis).</w:t>
+        <w:t>Passo 1 — Casos de uso e classes: Resgatar Combo Grátis JÁ existe desde a Aula 4, ligado ao ator Cliente — nada muda. Nas classes, a regra nova vira métodos do Pedido: + temComboGratis(): Booleano (verdadeiro se o pedido já tem um combo grátis) e + adicionarComboGratis() (inclui o combo com preço R$ 0,00). A regra dos 100 pontos vira + podeResgatar(): Booleano no Cliente (verdadeiro se pontosFidelidade ≥ 100). resgatarCombo() já existia no Cliente (Aula 5) e é ele que zera os pontos.</w:t>
       </w:r>
     </w:p>
     <w:p>
       <w:r>
-        <w:t>3.  Classes: a regra dos 100 pontos vira método do Cliente → + podeResgatar(): Booleano (verdadeiro se pontosFidelidade ≥ 100).</w:t>
+        <w:t>Passo 2 — Atividades, o começo: “Start” no topo da raia Cliente e, logo abaixo, a ação “Pede o combo grátis no carrinho”, ligadas por uma seta.</w:t>
       </w:r>
     </w:p>
     <w:p>
       <w:r>
-        <w:t>4.  Classes: resgatarCombo() já existia no Cliente (Aula 5) e é ele que zera os pontos; o Pedido ganha + adicionarComboGratis(), que inclui o combo com preço R$ 0,00.</w:t>
+        <w:t>Passo 3 — 1ª decisão, a regra nova: na raia Sistema, um losango “Condition” com “O pedido já tem um combo grátis?”. Saída [sim]: ação “Informa: só 1 combo grátis por pedido” e nó final. Uma nota amarela com a regra nova fica ligada ao losango por uma linha tracejada.</w:t>
       </w:r>
     </w:p>
     <w:p>
       <w:r>
-        <w:t>5.  Abram o “Aula 9 - Exemplo Guiado (ponto de partida).drawio”: a página Atividades já tem as raias Cliente e Sistema; a página Sequência já tem os 4 participantes (o ator Cliente, :App, :Pedido e :Cliente).</w:t>
+        <w:t>Passo 4 — 2ª decisão, os 100 pontos: a saída [não] da 1ª decisão leva ao losango “Tem 100 pontos ou mais?”. Saída [não]: “Informa quantos pontos faltam” e nó final. Outra nota amarela com a Regra 2 da Aula 1.</w:t>
       </w:r>
     </w:p>
     <w:p>
       <w:r>
-        <w:t>6.  Atividades: Pede o combo grátis no carrinho → decisão [o pedido já tem um combo grátis?] → [não] → decisão [tem 100 pontos ou mais?] → [sim] → Zera os pontos do cliente → Adiciona o combo (R$ 0,00) ao pedido → Vê o combo grátis no carrinho. O [sim] da primeira decisão e o [não] da segunda terminam com uma mensagem ao cliente.</w:t>
+        <w:t>Passo 5 — O caminho [sim]: “Zera os pontos do cliente” → “Adiciona o combo (R$ 0,00) ao pedido” → de volta à raia Cliente, “Vê o combo grátis no carrinho” → nó final. O diagrama fica com três caminhos: já tem combo, faltam pontos, resgatou.</w:t>
       </w:r>
     </w:p>
     <w:p>
       <w:r>
-        <w:t>7.  Sequência: 1: pedirComboGratis() → 2: temComboGratis() no :Pedido → 3: podeResgatar() no :Cliente → alt [temCombo = falso e pode = verdadeiro]: 4: resgatarCombo() no :Cliente e 5: adicionarComboGratis() no :Pedido → comboAdicionado; [senão]: motivoRecusa.</w:t>
+        <w:t>Passo 6 — Sequência, primeiro o app PERGUNTA: 1: pedirComboGratis() do Cliente ao :App; 2: temComboGratis() do :App ao :Pedido (retorno temCombo); 3: podeResgatar() do :App ao :Cliente (retorno pode). Cada mensagem é um método da classe que a recebe (Passo 1).</w:t>
+      </w:r>
+    </w:p>
+    <w:p>
+      <w:r>
+        <w:t>Passo 7 — O alt: moldura alt [temCombo = falso e pode = verdadeiro] com 4: resgatarCombo() no :Cliente (retorno resgatou) e 5: adicionarComboGratis() no :Pedido (retorno comboAdicionado, que o :App devolve ao cliente). Abaixo da linha tracejada, [senão]: o :App devolve motivoRecusa ao cliente. As duas decisões da atividade viraram UM alt.</w:t>
       </w:r>
     </w:p>
     <w:p>
@@ -2907,6 +2904,44 @@
       </w:pPr>
       <w:r>
         <w:t>A ordem é a mesma: primeiro conferir, depois zerar os pontos e adicionar o combo.</w:t>
+      </w:r>
+    </w:p>
+    <w:p>
+      <w:pPr>
+        <w:pStyle w:val="Heading2"/>
+      </w:pPr>
+      <w:r>
+        <w:t>5.2 Revisão: o que cada diagrama mostrou</w:t>
+      </w:r>
+    </w:p>
+    <w:p>
+      <w:r>
+        <w:t>Depois de construir, vale olhar o resultado diagrama por diagrama e lembrar os conceitos principais de cada um (slides 59 a 64).</w:t>
+      </w:r>
+    </w:p>
+    <w:p>
+      <w:r>
+        <w:t>Casos de uso — O QUE o sistema oferece e PARA QUEM. O ator (boneco) é quem usa o sistema e fica FORA da fronteira; cada caso de uso (elipse) é um objetivo do ator, escrito com verbo; a fronteira (retângulo com o nome do sistema) separa o que é do sistema. No guiado, a regra nova não criou caso de uso: Resgatar Combo Grátis já existia, ligado ao Cliente. O que mudou foi como ele funciona por dentro — e isso aparece nos outros três diagramas.</w:t>
+      </w:r>
+    </w:p>
+    <w:p>
+      <w:r>
+        <w:t>Classes — QUAIS DADOS existem e COMO se ligam. Cada classe tem nome, atributos (- nome: tipo, os dados que ela guarda, como pontosFidelidade) e métodos (+ nome(), o que ela sabe fazer, como podeResgatar()). As associações ligam as classes, com cardinalidade nas duas pontas: 1 Cliente faz * (muitos) Pedidos. No guiado, a regra nova virou métodos novos — temComboGratis() e adicionarComboGratis() no Pedido, podeResgatar() no Cliente. É o único dos quatro diagramas que é ESTRUTURAL: mostra o que o sistema guarda, não a ordem das coisas.</w:t>
+      </w:r>
+    </w:p>
+    <w:p>
+      <w:r>
+        <w:t>Atividades — O PASSO A PASSO e QUEM faz cada passo (Figura 7). As raias (Cliente e Sistema) dizem quem executa cada ação; o nó inicial (bolinha preta) e o nó final (alvo) marcam onde o fluxo começa e termina; cada ação é um passo com verbo; cada decisão (losango) é uma pergunta, com as saídas entre colchetes ([sim] / [não]). No guiado, duas decisões geraram três caminhos: o pedido já tem combo, faltam pontos, ou o cliente resgata. As notas amarelas mostram de qual regra de negócio veio cada decisão.</w:t>
+      </w:r>
+    </w:p>
+    <w:p>
+      <w:r>
+        <w:t>Sequência — QUEM CHAMA QUEM e em que ORDEM (Figura 8). No topo ficam os participantes: o ator Cliente e os objetos :App, :Pedido e :Cliente. Cada mensagem (seta cheia, numerada) chama um método de quem recebe — 2: temComboGratis() é um método do Pedido; cada retorno (seta tracejada) leva a resposta de volta; a ativação (retângulo fino) mostra o tempo em que o objeto está trabalhando. O alt com a guarda [temCombo = falso e pode = verdadeiro] faz o resgate; o [senão] devolve o motivo da recusa. A ordem se lê de cima para baixo: primeiro o app pergunta (mensagens 1 a 3), depois age (4 e 5).</w:t>
+      </w:r>
+    </w:p>
+    <w:p>
+      <w:r>
+        <w:t>Como os quatro se ligam: o Cliente é ator, raia e participante, com o mesmo nome; temComboGratis() é método do Pedido no diagrama de classes e mensagem 2 na sequência; a decisão [o pedido já tem um combo grátis?] da atividade virou o temCombo da guarda do alt; e a ordem é a mesma nos dois diagramas de comportamento — primeiro conferir, depois zerar os pontos e adicionar o combo. A regra “só 1 combo por pedido” aparece nos quatro: é isso que significa um modelo COERENTE.</w:t>
       </w:r>
     </w:p>
     <w:p>
@@ -4140,6 +4175,22 @@
     </w:p>
     <w:p>
       <w:pPr>
+        <w:pStyle w:val="ListBullet"/>
+      </w:pPr>
+      <w:r>
+        <w:t>“Avaliar SEMPRE gera orçamento”: o que sempre acontece é «include»; o que só às vezes, «extend»</w:t>
+      </w:r>
+    </w:p>
+    <w:p>
+      <w:pPr>
+        <w:pStyle w:val="ListBullet"/>
+      </w:pPr>
+      <w:r>
+        <w:t>Mensagem para um objeto :X = método da classe X (ex.: aprovar() de Orcamento)</w:t>
+      </w:r>
+    </w:p>
+    <w:p>
+      <w:pPr>
         <w:pStyle w:val="Heading2"/>
       </w:pPr>
       <w:r>
@@ -4231,877 +4282,7 @@
         <w:pStyle w:val="Heading1"/>
       </w:pPr>
       <w:r>
-        <w:t>8. Atividade prática 2 — Matriz de rastreabilidade da EcoBike (individual)</w:t>
-      </w:r>
-    </w:p>
-    <w:p>
-      <w:r>
-        <w:rPr>
-          <w:i w:val="0"/>
-        </w:rPr>
-        <w:t>Sozinho(a), monte a matriz de rastreabilidade de 4 regras da EcoBike. Use o modelo do seu grupo e a resposta-modelo projetada na correção coletiva da Atividade 1. Uma linha por regra; em cada célula, o NOME exato do elemento naquele diagrama. Célula vazia = lacuna: diga se a regra sumiu ali ou se não se aplica. Tempo: 15 minutos, mais 5 de correção.</w:t>
-      </w:r>
-    </w:p>
-    <w:p>
-      <w:pPr>
-        <w:pStyle w:val="ListBullet"/>
-      </w:pPr>
-      <w:r>
-        <w:rPr>
-          <w:b/>
-        </w:rPr>
-        <w:t xml:space="preserve">R1 — </w:t>
-      </w:r>
-      <w:r>
-        <w:t>O serviço só começa depois que o cliente aprova o orçamento.</w:t>
-      </w:r>
-    </w:p>
-    <w:p>
-      <w:pPr>
-        <w:pStyle w:val="ListBullet"/>
-      </w:pPr>
-      <w:r>
-        <w:rPr>
-          <w:b/>
-        </w:rPr>
-        <w:t xml:space="preserve">R2 — </w:t>
-      </w:r>
-      <w:r>
-        <w:t>Orçamento recusado encerra a ordem de serviço.</w:t>
-      </w:r>
-    </w:p>
-    <w:p>
-      <w:pPr>
-        <w:pStyle w:val="ListBullet"/>
-      </w:pPr>
-      <w:r>
-        <w:rPr>
-          <w:b/>
-        </w:rPr>
-        <w:t xml:space="preserve">R3 — </w:t>
-      </w:r>
-      <w:r>
-        <w:t>Concluído o serviço, o cliente é notificado para retirar a bicicleta.</w:t>
-      </w:r>
-    </w:p>
-    <w:p>
-      <w:pPr>
-        <w:pStyle w:val="ListBullet"/>
-      </w:pPr>
-      <w:r>
-        <w:rPr>
-          <w:b/>
-        </w:rPr>
-        <w:t xml:space="preserve">R4 — </w:t>
-      </w:r>
-      <w:r>
-        <w:t>O pagamento é feito na retirada.</w:t>
-      </w:r>
-    </w:p>
-    <w:p>
-      <w:r>
-        <w:rPr>
-          <w:i w:val="0"/>
-        </w:rPr>
-        <w:t>Exemplo pronto do formato (a regra do desconto PIX, do TechBurger):</w:t>
-      </w:r>
-    </w:p>
-    <w:tbl>
-      <w:tblPr>
-        <w:tblStyle w:val="TableGrid"/>
-        <w:tblW w:type="auto" w:w="0"/>
-        <w:tblLook w:firstColumn="1" w:firstRow="1" w:lastColumn="0" w:lastRow="0" w:noHBand="0" w:noVBand="1" w:val="04A0"/>
-      </w:tblPr>
-      <w:tblGrid>
-        <w:gridCol w:w="1662"/>
-        <w:gridCol w:w="1662"/>
-        <w:gridCol w:w="1662"/>
-        <w:gridCol w:w="1662"/>
-        <w:gridCol w:w="1662"/>
-        <w:gridCol w:w="1662"/>
-      </w:tblGrid>
-      <w:tr>
-        <w:tc>
-          <w:tcPr>
-            <w:tcW w:type="dxa" w:w="1662"/>
-            <w:shd w:val="clear" w:color="auto" w:fill="1F497D"/>
-          </w:tcPr>
-          <w:p>
-            <w:pPr>
-              <w:spacing w:after="40"/>
-            </w:pPr>
-            <w:r>
-              <w:rPr>
-                <w:b/>
-                <w:color w:val="FFFFFF"/>
-                <w:sz w:val="20"/>
-              </w:rPr>
-              <w:t>Regra</w:t>
-            </w:r>
-          </w:p>
-        </w:tc>
-        <w:tc>
-          <w:tcPr>
-            <w:tcW w:type="dxa" w:w="1662"/>
-            <w:shd w:val="clear" w:color="auto" w:fill="1F497D"/>
-          </w:tcPr>
-          <w:p>
-            <w:pPr>
-              <w:spacing w:after="40"/>
-            </w:pPr>
-            <w:r>
-              <w:rPr>
-                <w:b/>
-                <w:color w:val="FFFFFF"/>
-                <w:sz w:val="20"/>
-              </w:rPr>
-              <w:t>RF</w:t>
-            </w:r>
-          </w:p>
-        </w:tc>
-        <w:tc>
-          <w:tcPr>
-            <w:tcW w:type="dxa" w:w="1662"/>
-            <w:shd w:val="clear" w:color="auto" w:fill="1F497D"/>
-          </w:tcPr>
-          <w:p>
-            <w:pPr>
-              <w:spacing w:after="40"/>
-            </w:pPr>
-            <w:r>
-              <w:rPr>
-                <w:b/>
-                <w:color w:val="FFFFFF"/>
-                <w:sz w:val="20"/>
-              </w:rPr>
-              <w:t>Caso de uso</w:t>
-            </w:r>
-          </w:p>
-        </w:tc>
-        <w:tc>
-          <w:tcPr>
-            <w:tcW w:type="dxa" w:w="1662"/>
-            <w:shd w:val="clear" w:color="auto" w:fill="1F497D"/>
-          </w:tcPr>
-          <w:p>
-            <w:pPr>
-              <w:spacing w:after="40"/>
-            </w:pPr>
-            <w:r>
-              <w:rPr>
-                <w:b/>
-                <w:color w:val="FFFFFF"/>
-                <w:sz w:val="20"/>
-              </w:rPr>
-              <w:t>Classes</w:t>
-            </w:r>
-          </w:p>
-        </w:tc>
-        <w:tc>
-          <w:tcPr>
-            <w:tcW w:type="dxa" w:w="1662"/>
-            <w:shd w:val="clear" w:color="auto" w:fill="1F497D"/>
-          </w:tcPr>
-          <w:p>
-            <w:pPr>
-              <w:spacing w:after="40"/>
-            </w:pPr>
-            <w:r>
-              <w:rPr>
-                <w:b/>
-                <w:color w:val="FFFFFF"/>
-                <w:sz w:val="20"/>
-              </w:rPr>
-              <w:t>Atividades</w:t>
-            </w:r>
-          </w:p>
-        </w:tc>
-        <w:tc>
-          <w:tcPr>
-            <w:tcW w:type="dxa" w:w="1662"/>
-            <w:shd w:val="clear" w:color="auto" w:fill="1F497D"/>
-          </w:tcPr>
-          <w:p>
-            <w:pPr>
-              <w:spacing w:after="40"/>
-            </w:pPr>
-            <w:r>
-              <w:rPr>
-                <w:b/>
-                <w:color w:val="FFFFFF"/>
-                <w:sz w:val="20"/>
-              </w:rPr>
-              <w:t>Sequência</w:t>
-            </w:r>
-          </w:p>
-        </w:tc>
-      </w:tr>
-      <w:tr>
-        <w:tc>
-          <w:tcPr>
-            <w:tcW w:type="dxa" w:w="1662"/>
-          </w:tcPr>
-          <w:p>
-            <w:pPr>
-              <w:spacing w:after="40"/>
-            </w:pPr>
-            <w:r>
-              <w:rPr>
-                <w:sz w:val="20"/>
-              </w:rPr>
-              <w:t>Desconto PIX de 5%</w:t>
-            </w:r>
-          </w:p>
-        </w:tc>
-        <w:tc>
-          <w:tcPr>
-            <w:tcW w:type="dxa" w:w="1662"/>
-          </w:tcPr>
-          <w:p>
-            <w:pPr>
-              <w:spacing w:after="40"/>
-            </w:pPr>
-            <w:r>
-              <w:rPr>
-                <w:sz w:val="20"/>
-              </w:rPr>
-              <w:t>O sistema deve aplicar 5% de desconto no pagamento via PIX pelo app</w:t>
-            </w:r>
-          </w:p>
-        </w:tc>
-        <w:tc>
-          <w:tcPr>
-            <w:tcW w:type="dxa" w:w="1662"/>
-          </w:tcPr>
-          <w:p>
-            <w:pPr>
-              <w:spacing w:after="40"/>
-            </w:pPr>
-            <w:r>
-              <w:rPr>
-                <w:sz w:val="20"/>
-              </w:rPr>
-              <w:t>Aplicar Desconto PIX («extend» de Confirmar Pagamento)</w:t>
-            </w:r>
-          </w:p>
-        </w:tc>
-        <w:tc>
-          <w:tcPr>
-            <w:tcW w:type="dxa" w:w="1662"/>
-          </w:tcPr>
-          <w:p>
-            <w:pPr>
-              <w:spacing w:after="40"/>
-            </w:pPr>
-            <w:r>
-              <w:rPr>
-                <w:sz w:val="20"/>
-              </w:rPr>
-              <w:t>Pagamento.forma; aplicarDesconto(): Real</w:t>
-            </w:r>
-          </w:p>
-        </w:tc>
-        <w:tc>
-          <w:tcPr>
-            <w:tcW w:type="dxa" w:w="1662"/>
-          </w:tcPr>
-          <w:p>
-            <w:pPr>
-              <w:spacing w:after="40"/>
-            </w:pPr>
-            <w:r>
-              <w:rPr>
-                <w:sz w:val="20"/>
-              </w:rPr>
-              <w:t>Ação “Aplica 5% de desconto (PIX)”</w:t>
-            </w:r>
-          </w:p>
-        </w:tc>
-        <w:tc>
-          <w:tcPr>
-            <w:tcW w:type="dxa" w:w="1662"/>
-          </w:tcPr>
-          <w:p>
-            <w:pPr>
-              <w:spacing w:after="40"/>
-            </w:pPr>
-            <w:r>
-              <w:rPr>
-                <w:sz w:val="20"/>
-              </w:rPr>
-              <w:t>8: aplicarDesconto() → valorComDesconto</w:t>
-            </w:r>
-          </w:p>
-        </w:tc>
-      </w:tr>
-    </w:tbl>
-    <w:p/>
-    <w:p>
-      <w:r>
-        <w:rPr>
-          <w:i w:val="0"/>
-        </w:rPr>
-        <w:t>Sua matriz:</w:t>
-      </w:r>
-    </w:p>
-    <w:tbl>
-      <w:tblPr>
-        <w:tblStyle w:val="TableGrid"/>
-        <w:tblW w:type="auto" w:w="0"/>
-        <w:tblLook w:firstColumn="1" w:firstRow="1" w:lastColumn="0" w:lastRow="0" w:noHBand="0" w:noVBand="1" w:val="04A0"/>
-      </w:tblPr>
-      <w:tblGrid>
-        <w:gridCol w:w="1662"/>
-        <w:gridCol w:w="1662"/>
-        <w:gridCol w:w="1662"/>
-        <w:gridCol w:w="1662"/>
-        <w:gridCol w:w="1662"/>
-        <w:gridCol w:w="1662"/>
-      </w:tblGrid>
-      <w:tr>
-        <w:tc>
-          <w:tcPr>
-            <w:tcW w:type="dxa" w:w="1662"/>
-            <w:shd w:val="clear" w:color="auto" w:fill="1F497D"/>
-          </w:tcPr>
-          <w:p>
-            <w:pPr>
-              <w:spacing w:after="40"/>
-            </w:pPr>
-            <w:r>
-              <w:rPr>
-                <w:b/>
-                <w:color w:val="FFFFFF"/>
-                <w:sz w:val="20"/>
-              </w:rPr>
-              <w:t>Regra</w:t>
-            </w:r>
-          </w:p>
-        </w:tc>
-        <w:tc>
-          <w:tcPr>
-            <w:tcW w:type="dxa" w:w="1662"/>
-            <w:shd w:val="clear" w:color="auto" w:fill="1F497D"/>
-          </w:tcPr>
-          <w:p>
-            <w:pPr>
-              <w:spacing w:after="40"/>
-            </w:pPr>
-            <w:r>
-              <w:rPr>
-                <w:b/>
-                <w:color w:val="FFFFFF"/>
-                <w:sz w:val="20"/>
-              </w:rPr>
-              <w:t>RF</w:t>
-            </w:r>
-          </w:p>
-        </w:tc>
-        <w:tc>
-          <w:tcPr>
-            <w:tcW w:type="dxa" w:w="1662"/>
-            <w:shd w:val="clear" w:color="auto" w:fill="1F497D"/>
-          </w:tcPr>
-          <w:p>
-            <w:pPr>
-              <w:spacing w:after="40"/>
-            </w:pPr>
-            <w:r>
-              <w:rPr>
-                <w:b/>
-                <w:color w:val="FFFFFF"/>
-                <w:sz w:val="20"/>
-              </w:rPr>
-              <w:t>Caso de uso</w:t>
-            </w:r>
-          </w:p>
-        </w:tc>
-        <w:tc>
-          <w:tcPr>
-            <w:tcW w:type="dxa" w:w="1662"/>
-            <w:shd w:val="clear" w:color="auto" w:fill="1F497D"/>
-          </w:tcPr>
-          <w:p>
-            <w:pPr>
-              <w:spacing w:after="40"/>
-            </w:pPr>
-            <w:r>
-              <w:rPr>
-                <w:b/>
-                <w:color w:val="FFFFFF"/>
-                <w:sz w:val="20"/>
-              </w:rPr>
-              <w:t>Classes</w:t>
-            </w:r>
-          </w:p>
-        </w:tc>
-        <w:tc>
-          <w:tcPr>
-            <w:tcW w:type="dxa" w:w="1662"/>
-            <w:shd w:val="clear" w:color="auto" w:fill="1F497D"/>
-          </w:tcPr>
-          <w:p>
-            <w:pPr>
-              <w:spacing w:after="40"/>
-            </w:pPr>
-            <w:r>
-              <w:rPr>
-                <w:b/>
-                <w:color w:val="FFFFFF"/>
-                <w:sz w:val="20"/>
-              </w:rPr>
-              <w:t>Atividades</w:t>
-            </w:r>
-          </w:p>
-        </w:tc>
-        <w:tc>
-          <w:tcPr>
-            <w:tcW w:type="dxa" w:w="1662"/>
-            <w:shd w:val="clear" w:color="auto" w:fill="1F497D"/>
-          </w:tcPr>
-          <w:p>
-            <w:pPr>
-              <w:spacing w:after="40"/>
-            </w:pPr>
-            <w:r>
-              <w:rPr>
-                <w:b/>
-                <w:color w:val="FFFFFF"/>
-                <w:sz w:val="20"/>
-              </w:rPr>
-              <w:t>Sequência</w:t>
-            </w:r>
-          </w:p>
-        </w:tc>
-      </w:tr>
-      <w:tr>
-        <w:tc>
-          <w:tcPr>
-            <w:tcW w:type="dxa" w:w="1662"/>
-          </w:tcPr>
-          <w:p>
-            <w:pPr>
-              <w:spacing w:after="40"/>
-            </w:pPr>
-            <w:r>
-              <w:rPr>
-                <w:sz w:val="20"/>
-              </w:rPr>
-              <w:t>R1</w:t>
-            </w:r>
-          </w:p>
-        </w:tc>
-        <w:tc>
-          <w:tcPr>
-            <w:tcW w:type="dxa" w:w="1662"/>
-          </w:tcPr>
-          <w:p>
-            <w:pPr>
-              <w:spacing w:after="40"/>
-            </w:pPr>
-            <w:r>
-              <w:rPr>
-                <w:sz w:val="20"/>
-              </w:rPr>
-            </w:r>
-          </w:p>
-        </w:tc>
-        <w:tc>
-          <w:tcPr>
-            <w:tcW w:type="dxa" w:w="1662"/>
-          </w:tcPr>
-          <w:p>
-            <w:pPr>
-              <w:spacing w:after="40"/>
-            </w:pPr>
-            <w:r>
-              <w:rPr>
-                <w:sz w:val="20"/>
-              </w:rPr>
-            </w:r>
-          </w:p>
-        </w:tc>
-        <w:tc>
-          <w:tcPr>
-            <w:tcW w:type="dxa" w:w="1662"/>
-          </w:tcPr>
-          <w:p>
-            <w:pPr>
-              <w:spacing w:after="40"/>
-            </w:pPr>
-            <w:r>
-              <w:rPr>
-                <w:sz w:val="20"/>
-              </w:rPr>
-            </w:r>
-          </w:p>
-        </w:tc>
-        <w:tc>
-          <w:tcPr>
-            <w:tcW w:type="dxa" w:w="1662"/>
-          </w:tcPr>
-          <w:p>
-            <w:pPr>
-              <w:spacing w:after="40"/>
-            </w:pPr>
-            <w:r>
-              <w:rPr>
-                <w:sz w:val="20"/>
-              </w:rPr>
-            </w:r>
-          </w:p>
-        </w:tc>
-        <w:tc>
-          <w:tcPr>
-            <w:tcW w:type="dxa" w:w="1662"/>
-          </w:tcPr>
-          <w:p>
-            <w:pPr>
-              <w:spacing w:after="40"/>
-            </w:pPr>
-            <w:r>
-              <w:rPr>
-                <w:sz w:val="20"/>
-              </w:rPr>
-            </w:r>
-          </w:p>
-        </w:tc>
-      </w:tr>
-      <w:tr>
-        <w:tc>
-          <w:tcPr>
-            <w:tcW w:type="dxa" w:w="1662"/>
-          </w:tcPr>
-          <w:p>
-            <w:pPr>
-              <w:spacing w:after="40"/>
-            </w:pPr>
-            <w:r>
-              <w:rPr>
-                <w:sz w:val="20"/>
-              </w:rPr>
-              <w:t>R2</w:t>
-            </w:r>
-          </w:p>
-        </w:tc>
-        <w:tc>
-          <w:tcPr>
-            <w:tcW w:type="dxa" w:w="1662"/>
-          </w:tcPr>
-          <w:p>
-            <w:pPr>
-              <w:spacing w:after="40"/>
-            </w:pPr>
-            <w:r>
-              <w:rPr>
-                <w:sz w:val="20"/>
-              </w:rPr>
-            </w:r>
-          </w:p>
-        </w:tc>
-        <w:tc>
-          <w:tcPr>
-            <w:tcW w:type="dxa" w:w="1662"/>
-          </w:tcPr>
-          <w:p>
-            <w:pPr>
-              <w:spacing w:after="40"/>
-            </w:pPr>
-            <w:r>
-              <w:rPr>
-                <w:sz w:val="20"/>
-              </w:rPr>
-            </w:r>
-          </w:p>
-        </w:tc>
-        <w:tc>
-          <w:tcPr>
-            <w:tcW w:type="dxa" w:w="1662"/>
-          </w:tcPr>
-          <w:p>
-            <w:pPr>
-              <w:spacing w:after="40"/>
-            </w:pPr>
-            <w:r>
-              <w:rPr>
-                <w:sz w:val="20"/>
-              </w:rPr>
-            </w:r>
-          </w:p>
-        </w:tc>
-        <w:tc>
-          <w:tcPr>
-            <w:tcW w:type="dxa" w:w="1662"/>
-          </w:tcPr>
-          <w:p>
-            <w:pPr>
-              <w:spacing w:after="40"/>
-            </w:pPr>
-            <w:r>
-              <w:rPr>
-                <w:sz w:val="20"/>
-              </w:rPr>
-            </w:r>
-          </w:p>
-        </w:tc>
-        <w:tc>
-          <w:tcPr>
-            <w:tcW w:type="dxa" w:w="1662"/>
-          </w:tcPr>
-          <w:p>
-            <w:pPr>
-              <w:spacing w:after="40"/>
-            </w:pPr>
-            <w:r>
-              <w:rPr>
-                <w:sz w:val="20"/>
-              </w:rPr>
-            </w:r>
-          </w:p>
-        </w:tc>
-      </w:tr>
-      <w:tr>
-        <w:tc>
-          <w:tcPr>
-            <w:tcW w:type="dxa" w:w="1662"/>
-          </w:tcPr>
-          <w:p>
-            <w:pPr>
-              <w:spacing w:after="40"/>
-            </w:pPr>
-            <w:r>
-              <w:rPr>
-                <w:sz w:val="20"/>
-              </w:rPr>
-              <w:t>R3</w:t>
-            </w:r>
-          </w:p>
-        </w:tc>
-        <w:tc>
-          <w:tcPr>
-            <w:tcW w:type="dxa" w:w="1662"/>
-          </w:tcPr>
-          <w:p>
-            <w:pPr>
-              <w:spacing w:after="40"/>
-            </w:pPr>
-            <w:r>
-              <w:rPr>
-                <w:sz w:val="20"/>
-              </w:rPr>
-            </w:r>
-          </w:p>
-        </w:tc>
-        <w:tc>
-          <w:tcPr>
-            <w:tcW w:type="dxa" w:w="1662"/>
-          </w:tcPr>
-          <w:p>
-            <w:pPr>
-              <w:spacing w:after="40"/>
-            </w:pPr>
-            <w:r>
-              <w:rPr>
-                <w:sz w:val="20"/>
-              </w:rPr>
-            </w:r>
-          </w:p>
-        </w:tc>
-        <w:tc>
-          <w:tcPr>
-            <w:tcW w:type="dxa" w:w="1662"/>
-          </w:tcPr>
-          <w:p>
-            <w:pPr>
-              <w:spacing w:after="40"/>
-            </w:pPr>
-            <w:r>
-              <w:rPr>
-                <w:sz w:val="20"/>
-              </w:rPr>
-            </w:r>
-          </w:p>
-        </w:tc>
-        <w:tc>
-          <w:tcPr>
-            <w:tcW w:type="dxa" w:w="1662"/>
-          </w:tcPr>
-          <w:p>
-            <w:pPr>
-              <w:spacing w:after="40"/>
-            </w:pPr>
-            <w:r>
-              <w:rPr>
-                <w:sz w:val="20"/>
-              </w:rPr>
-            </w:r>
-          </w:p>
-        </w:tc>
-        <w:tc>
-          <w:tcPr>
-            <w:tcW w:type="dxa" w:w="1662"/>
-          </w:tcPr>
-          <w:p>
-            <w:pPr>
-              <w:spacing w:after="40"/>
-            </w:pPr>
-            <w:r>
-              <w:rPr>
-                <w:sz w:val="20"/>
-              </w:rPr>
-            </w:r>
-          </w:p>
-        </w:tc>
-      </w:tr>
-      <w:tr>
-        <w:tc>
-          <w:tcPr>
-            <w:tcW w:type="dxa" w:w="1662"/>
-          </w:tcPr>
-          <w:p>
-            <w:pPr>
-              <w:spacing w:after="40"/>
-            </w:pPr>
-            <w:r>
-              <w:rPr>
-                <w:sz w:val="20"/>
-              </w:rPr>
-              <w:t>R4</w:t>
-            </w:r>
-          </w:p>
-        </w:tc>
-        <w:tc>
-          <w:tcPr>
-            <w:tcW w:type="dxa" w:w="1662"/>
-          </w:tcPr>
-          <w:p>
-            <w:pPr>
-              <w:spacing w:after="40"/>
-            </w:pPr>
-            <w:r>
-              <w:rPr>
-                <w:sz w:val="20"/>
-              </w:rPr>
-            </w:r>
-          </w:p>
-        </w:tc>
-        <w:tc>
-          <w:tcPr>
-            <w:tcW w:type="dxa" w:w="1662"/>
-          </w:tcPr>
-          <w:p>
-            <w:pPr>
-              <w:spacing w:after="40"/>
-            </w:pPr>
-            <w:r>
-              <w:rPr>
-                <w:sz w:val="20"/>
-              </w:rPr>
-            </w:r>
-          </w:p>
-        </w:tc>
-        <w:tc>
-          <w:tcPr>
-            <w:tcW w:type="dxa" w:w="1662"/>
-          </w:tcPr>
-          <w:p>
-            <w:pPr>
-              <w:spacing w:after="40"/>
-            </w:pPr>
-            <w:r>
-              <w:rPr>
-                <w:sz w:val="20"/>
-              </w:rPr>
-            </w:r>
-          </w:p>
-        </w:tc>
-        <w:tc>
-          <w:tcPr>
-            <w:tcW w:type="dxa" w:w="1662"/>
-          </w:tcPr>
-          <w:p>
-            <w:pPr>
-              <w:spacing w:after="40"/>
-            </w:pPr>
-            <w:r>
-              <w:rPr>
-                <w:sz w:val="20"/>
-              </w:rPr>
-            </w:r>
-          </w:p>
-        </w:tc>
-        <w:tc>
-          <w:tcPr>
-            <w:tcW w:type="dxa" w:w="1662"/>
-          </w:tcPr>
-          <w:p>
-            <w:pPr>
-              <w:spacing w:after="40"/>
-            </w:pPr>
-            <w:r>
-              <w:rPr>
-                <w:sz w:val="20"/>
-              </w:rPr>
-            </w:r>
-          </w:p>
-        </w:tc>
-      </w:tr>
-    </w:tbl>
-    <w:p/>
-    <w:p>
-      <w:r>
-        <w:rPr>
-          <w:i w:val="0"/>
-        </w:rPr>
-        <w:t>Pergunta final: qual regra tem uma lacuna no diagrama de sequência? Como vocês corrigiriam o diagrama?</w:t>
-      </w:r>
-    </w:p>
-    <w:p>
-      <w:pPr>
-        <w:pStyle w:val="Heading2"/>
-      </w:pPr>
-      <w:r>
-        <w:t>Checklist da atividade 2</w:t>
-      </w:r>
-    </w:p>
-    <w:p>
-      <w:pPr>
-        <w:pStyle w:val="ListBullet"/>
-      </w:pPr>
-      <w:r>
-        <w:t>As 4 linhas preenchidas, com o nome exato do elemento em cada diagrama.</w:t>
-      </w:r>
-    </w:p>
-    <w:p>
-      <w:pPr>
-        <w:pStyle w:val="ListBullet"/>
-      </w:pPr>
-      <w:r>
-        <w:t>Toda célula vazia tem explicação: lacuna ou “não se aplica”.</w:t>
-      </w:r>
-    </w:p>
-    <w:p>
-      <w:pPr>
-        <w:pStyle w:val="ListBullet"/>
-      </w:pPr>
-      <w:r>
-        <w:t>A lacuna encontrada — e a correção proposta.</w:t>
-      </w:r>
-    </w:p>
-    <w:p>
-      <w:pPr>
-        <w:pStyle w:val="ListBullet"/>
-      </w:pPr>
-      <w:r>
-        <w:t>Os RF começam com “O sistema deve...”.</w:t>
-      </w:r>
-    </w:p>
-    <w:p>
-      <w:pPr>
-        <w:pStyle w:val="Heading1"/>
-      </w:pPr>
-      <w:r>
-        <w:t>9. Exercício: encontre as incoerências</w:t>
+        <w:t>8. Exercício: encontre as incoerências</w:t>
       </w:r>
     </w:p>
     <w:p>
@@ -5178,1419 +4359,7 @@
         <w:pStyle w:val="Heading1"/>
       </w:pPr>
       <w:r>
-        <w:t>10. Atividade prática 3 — Revisão geral das Aulas 1 a 9 (ParkFácil, em duplas)</w:t>
-      </w:r>
-    </w:p>
-    <w:p>
-      <w:r>
-        <w:rPr>
-          <w:i w:val="0"/>
-        </w:rPr>
-        <w:t>A Atividade 1 treinou os 4 diagramas; esta treina o caminho INTEIRO, desde o texto do cliente: regras → requisitos → critério de aceite → casos de uso → classes → um diagrama de comportamento. Domínio novo, que nunca apareceu no curso. Tempo: 35 minutos, em duplas.</w:t>
-      </w:r>
-    </w:p>
-    <w:p>
-      <w:pPr>
-        <w:pStyle w:val="Heading2"/>
-      </w:pPr>
-      <w:r>
-        <w:t>10.1 O cenário ParkFácil</w:t>
-      </w:r>
-    </w:p>
-    <w:p>
-      <w:r>
-        <w:rPr>
-          <w:i w:val="0"/>
-        </w:rPr>
-        <w:t>O ParkFácil é o estacionamento de um shopping e quer um aplicativo. Na entrada, a cancela lê a placa do veículo e registra a hora. Os primeiros 15 minutos são gratuitos (tolerância). Depois, a tarifa é de R$ 8,00 pela primeira hora e R$ 3,00 por hora adicional, com teto de R$ 40,00 por dia. Mensalistas não pagam por uso; cada mensalista pode cadastrar até 2 veículos. O pagamento é feito no app, por cartão ou PIX, num sistema de pagamento externo, antes de sair. Depois de pagar, o motorista tem 15 minutos para sair; se passar disso, paga a diferença. O operador do estacionamento pode liberar a cancela manualmente em caso de problema. O app precisa mostrar as vagas livres em até 2 segundos e funcionar em Android e iOS.</w:t>
-      </w:r>
-    </w:p>
-    <w:p>
-      <w:pPr>
-        <w:pStyle w:val="Heading2"/>
-      </w:pPr>
-      <w:r>
-        <w:t>10.2 Relembrando rapidamente cada aula</w:t>
-      </w:r>
-    </w:p>
-    <w:tbl>
-      <w:tblPr>
-        <w:tblStyle w:val="TableGrid"/>
-        <w:tblW w:type="auto" w:w="0"/>
-        <w:tblLook w:firstColumn="1" w:firstRow="1" w:lastColumn="0" w:lastRow="0" w:noHBand="0" w:noVBand="1" w:val="04A0"/>
-      </w:tblPr>
-      <w:tblGrid>
-        <w:gridCol w:w="3324"/>
-        <w:gridCol w:w="3324"/>
-        <w:gridCol w:w="3324"/>
-      </w:tblGrid>
-      <w:tr>
-        <w:tc>
-          <w:tcPr>
-            <w:tcW w:type="dxa" w:w="3324"/>
-            <w:shd w:val="clear" w:color="auto" w:fill="1F497D"/>
-          </w:tcPr>
-          <w:p>
-            <w:pPr>
-              <w:spacing w:after="40"/>
-            </w:pPr>
-            <w:r>
-              <w:rPr>
-                <w:b/>
-                <w:color w:val="FFFFFF"/>
-                <w:sz w:val="20"/>
-              </w:rPr>
-              <w:t>Aula</w:t>
-            </w:r>
-          </w:p>
-        </w:tc>
-        <w:tc>
-          <w:tcPr>
-            <w:tcW w:type="dxa" w:w="3324"/>
-            <w:shd w:val="clear" w:color="auto" w:fill="1F497D"/>
-          </w:tcPr>
-          <w:p>
-            <w:pPr>
-              <w:spacing w:after="40"/>
-            </w:pPr>
-            <w:r>
-              <w:rPr>
-                <w:b/>
-                <w:color w:val="FFFFFF"/>
-                <w:sz w:val="20"/>
-              </w:rPr>
-              <w:t>Conceito</w:t>
-            </w:r>
-          </w:p>
-        </w:tc>
-        <w:tc>
-          <w:tcPr>
-            <w:tcW w:type="dxa" w:w="3324"/>
-            <w:shd w:val="clear" w:color="auto" w:fill="1F497D"/>
-          </w:tcPr>
-          <w:p>
-            <w:pPr>
-              <w:spacing w:after="40"/>
-            </w:pPr>
-            <w:r>
-              <w:rPr>
-                <w:b/>
-                <w:color w:val="FFFFFF"/>
-                <w:sz w:val="20"/>
-              </w:rPr>
-              <w:t>Formato que vamos usar hoje</w:t>
-            </w:r>
-          </w:p>
-        </w:tc>
-      </w:tr>
-      <w:tr>
-        <w:tc>
-          <w:tcPr>
-            <w:tcW w:type="dxa" w:w="3324"/>
-          </w:tcPr>
-          <w:p>
-            <w:pPr>
-              <w:spacing w:after="40"/>
-            </w:pPr>
-            <w:r>
-              <w:rPr>
-                <w:sz w:val="20"/>
-              </w:rPr>
-              <w:t>1</w:t>
-            </w:r>
-          </w:p>
-        </w:tc>
-        <w:tc>
-          <w:tcPr>
-            <w:tcW w:type="dxa" w:w="3324"/>
-          </w:tcPr>
-          <w:p>
-            <w:pPr>
-              <w:spacing w:after="40"/>
-            </w:pPr>
-            <w:r>
-              <w:rPr>
-                <w:sz w:val="20"/>
-              </w:rPr>
-              <w:t>Regra de negócio</w:t>
-            </w:r>
-          </w:p>
-        </w:tc>
-        <w:tc>
-          <w:tcPr>
-            <w:tcW w:type="dxa" w:w="3324"/>
-          </w:tcPr>
-          <w:p>
-            <w:pPr>
-              <w:spacing w:after="40"/>
-            </w:pPr>
-            <w:r>
-              <w:rPr>
-                <w:sz w:val="20"/>
-              </w:rPr>
-              <w:t>Condição (o “se”) / Ação (o “então”) / Exceção (quando não vale)</w:t>
-            </w:r>
-          </w:p>
-        </w:tc>
-      </w:tr>
-      <w:tr>
-        <w:tc>
-          <w:tcPr>
-            <w:tcW w:type="dxa" w:w="3324"/>
-          </w:tcPr>
-          <w:p>
-            <w:pPr>
-              <w:spacing w:after="40"/>
-            </w:pPr>
-            <w:r>
-              <w:rPr>
-                <w:sz w:val="20"/>
-              </w:rPr>
-              <w:t>2</w:t>
-            </w:r>
-          </w:p>
-        </w:tc>
-        <w:tc>
-          <w:tcPr>
-            <w:tcW w:type="dxa" w:w="3324"/>
-          </w:tcPr>
-          <w:p>
-            <w:pPr>
-              <w:spacing w:after="40"/>
-            </w:pPr>
-            <w:r>
-              <w:rPr>
-                <w:sz w:val="20"/>
-              </w:rPr>
-              <w:t>Requisito funcional e não funcional</w:t>
-            </w:r>
-          </w:p>
-        </w:tc>
-        <w:tc>
-          <w:tcPr>
-            <w:tcW w:type="dxa" w:w="3324"/>
-          </w:tcPr>
-          <w:p>
-            <w:pPr>
-              <w:spacing w:after="40"/>
-            </w:pPr>
-            <w:r>
-              <w:rPr>
-                <w:sz w:val="20"/>
-              </w:rPr>
-              <w:t>RF: “O sistema deve [verbo]...”. RNF: qualidade mensurável (tempo, plataforma, segurança)</w:t>
-            </w:r>
-          </w:p>
-        </w:tc>
-      </w:tr>
-      <w:tr>
-        <w:tc>
-          <w:tcPr>
-            <w:tcW w:type="dxa" w:w="3324"/>
-          </w:tcPr>
-          <w:p>
-            <w:pPr>
-              <w:spacing w:after="40"/>
-            </w:pPr>
-            <w:r>
-              <w:rPr>
-                <w:sz w:val="20"/>
-              </w:rPr>
-              <w:t>3</w:t>
-            </w:r>
-          </w:p>
-        </w:tc>
-        <w:tc>
-          <w:tcPr>
-            <w:tcW w:type="dxa" w:w="3324"/>
-          </w:tcPr>
-          <w:p>
-            <w:pPr>
-              <w:spacing w:after="40"/>
-            </w:pPr>
-            <w:r>
-              <w:rPr>
-                <w:sz w:val="20"/>
-              </w:rPr>
-              <w:t>Critério de aceite</w:t>
-            </w:r>
-          </w:p>
-        </w:tc>
-        <w:tc>
-          <w:tcPr>
-            <w:tcW w:type="dxa" w:w="3324"/>
-          </w:tcPr>
-          <w:p>
-            <w:pPr>
-              <w:spacing w:after="40"/>
-            </w:pPr>
-            <w:r>
-              <w:rPr>
-                <w:sz w:val="20"/>
-              </w:rPr>
-              <w:t>Dado [contexto] / Quando [ação] / Então [resultado esperado]</w:t>
-            </w:r>
-          </w:p>
-        </w:tc>
-      </w:tr>
-      <w:tr>
-        <w:tc>
-          <w:tcPr>
-            <w:tcW w:type="dxa" w:w="3324"/>
-          </w:tcPr>
-          <w:p>
-            <w:pPr>
-              <w:spacing w:after="40"/>
-            </w:pPr>
-            <w:r>
-              <w:rPr>
-                <w:sz w:val="20"/>
-              </w:rPr>
-              <w:t>4</w:t>
-            </w:r>
-          </w:p>
-        </w:tc>
-        <w:tc>
-          <w:tcPr>
-            <w:tcW w:type="dxa" w:w="3324"/>
-          </w:tcPr>
-          <w:p>
-            <w:pPr>
-              <w:spacing w:after="40"/>
-            </w:pPr>
-            <w:r>
-              <w:rPr>
-                <w:sz w:val="20"/>
-              </w:rPr>
-              <w:t>Casos de uso</w:t>
-            </w:r>
-          </w:p>
-        </w:tc>
-        <w:tc>
-          <w:tcPr>
-            <w:tcW w:type="dxa" w:w="3324"/>
-          </w:tcPr>
-          <w:p>
-            <w:pPr>
-              <w:spacing w:after="40"/>
-            </w:pPr>
-            <w:r>
-              <w:rPr>
-                <w:sz w:val="20"/>
-              </w:rPr>
-              <w:t>Atores fora da fronteira; casos de uso com verbo; «include» = sempre; «extend» = só às vezes</w:t>
-            </w:r>
-          </w:p>
-        </w:tc>
-      </w:tr>
-      <w:tr>
-        <w:tc>
-          <w:tcPr>
-            <w:tcW w:type="dxa" w:w="3324"/>
-          </w:tcPr>
-          <w:p>
-            <w:pPr>
-              <w:spacing w:after="40"/>
-            </w:pPr>
-            <w:r>
-              <w:rPr>
-                <w:sz w:val="20"/>
-              </w:rPr>
-              <w:t>5</w:t>
-            </w:r>
-          </w:p>
-        </w:tc>
-        <w:tc>
-          <w:tcPr>
-            <w:tcW w:type="dxa" w:w="3324"/>
-          </w:tcPr>
-          <w:p>
-            <w:pPr>
-              <w:spacing w:after="40"/>
-            </w:pPr>
-            <w:r>
-              <w:rPr>
-                <w:sz w:val="20"/>
-              </w:rPr>
-              <w:t>Classes</w:t>
-            </w:r>
-          </w:p>
-        </w:tc>
-        <w:tc>
-          <w:tcPr>
-            <w:tcW w:type="dxa" w:w="3324"/>
-          </w:tcPr>
-          <w:p>
-            <w:pPr>
-              <w:spacing w:after="40"/>
-            </w:pPr>
-            <w:r>
-              <w:rPr>
-                <w:sz w:val="20"/>
-              </w:rPr>
-              <w:t>Nome / atributos (- nome: tipo) / métodos (+ nome())</w:t>
-            </w:r>
-          </w:p>
-        </w:tc>
-      </w:tr>
-      <w:tr>
-        <w:tc>
-          <w:tcPr>
-            <w:tcW w:type="dxa" w:w="3324"/>
-          </w:tcPr>
-          <w:p>
-            <w:pPr>
-              <w:spacing w:after="40"/>
-            </w:pPr>
-            <w:r>
-              <w:rPr>
-                <w:sz w:val="20"/>
-              </w:rPr>
-              <w:t>6</w:t>
-            </w:r>
-          </w:p>
-        </w:tc>
-        <w:tc>
-          <w:tcPr>
-            <w:tcW w:type="dxa" w:w="3324"/>
-          </w:tcPr>
-          <w:p>
-            <w:pPr>
-              <w:spacing w:after="40"/>
-            </w:pPr>
-            <w:r>
-              <w:rPr>
-                <w:sz w:val="20"/>
-              </w:rPr>
-              <w:t>Cardinalidade</w:t>
-            </w:r>
-          </w:p>
-        </w:tc>
-        <w:tc>
-          <w:tcPr>
-            <w:tcW w:type="dxa" w:w="3324"/>
-          </w:tcPr>
-          <w:p>
-            <w:pPr>
-              <w:spacing w:after="40"/>
-            </w:pPr>
-            <w:r>
-              <w:rPr>
-                <w:sz w:val="20"/>
-              </w:rPr>
-              <w:t>1, 0..1, 0..* (*), 1..* e faixas como 1..2 nas duas pontas; herança sem números</w:t>
-            </w:r>
-          </w:p>
-        </w:tc>
-      </w:tr>
-      <w:tr>
-        <w:tc>
-          <w:tcPr>
-            <w:tcW w:type="dxa" w:w="3324"/>
-          </w:tcPr>
-          <w:p>
-            <w:pPr>
-              <w:spacing w:after="40"/>
-            </w:pPr>
-            <w:r>
-              <w:rPr>
-                <w:sz w:val="20"/>
-              </w:rPr>
-              <w:t>7</w:t>
-            </w:r>
-          </w:p>
-        </w:tc>
-        <w:tc>
-          <w:tcPr>
-            <w:tcW w:type="dxa" w:w="3324"/>
-          </w:tcPr>
-          <w:p>
-            <w:pPr>
-              <w:spacing w:after="40"/>
-            </w:pPr>
-            <w:r>
-              <w:rPr>
-                <w:sz w:val="20"/>
-              </w:rPr>
-              <w:t>Atividades</w:t>
-            </w:r>
-          </w:p>
-        </w:tc>
-        <w:tc>
-          <w:tcPr>
-            <w:tcW w:type="dxa" w:w="3324"/>
-          </w:tcPr>
-          <w:p>
-            <w:pPr>
-              <w:spacing w:after="40"/>
-            </w:pPr>
-            <w:r>
-              <w:rPr>
-                <w:sz w:val="20"/>
-              </w:rPr>
-              <w:t>Nó inicial, ações, decisões com guardas, junção, raias, nó final</w:t>
-            </w:r>
-          </w:p>
-        </w:tc>
-      </w:tr>
-      <w:tr>
-        <w:tc>
-          <w:tcPr>
-            <w:tcW w:type="dxa" w:w="3324"/>
-          </w:tcPr>
-          <w:p>
-            <w:pPr>
-              <w:spacing w:after="40"/>
-            </w:pPr>
-            <w:r>
-              <w:rPr>
-                <w:sz w:val="20"/>
-              </w:rPr>
-              <w:t>8</w:t>
-            </w:r>
-          </w:p>
-        </w:tc>
-        <w:tc>
-          <w:tcPr>
-            <w:tcW w:type="dxa" w:w="3324"/>
-          </w:tcPr>
-          <w:p>
-            <w:pPr>
-              <w:spacing w:after="40"/>
-            </w:pPr>
-            <w:r>
-              <w:rPr>
-                <w:sz w:val="20"/>
-              </w:rPr>
-              <w:t>Sequência</w:t>
-            </w:r>
-          </w:p>
-        </w:tc>
-        <w:tc>
-          <w:tcPr>
-            <w:tcW w:type="dxa" w:w="3324"/>
-          </w:tcPr>
-          <w:p>
-            <w:pPr>
-              <w:spacing w:after="40"/>
-            </w:pPr>
-            <w:r>
-              <w:rPr>
-                <w:sz w:val="20"/>
-              </w:rPr>
-              <w:t>Participantes, mensagens numeradas, retornos tracejados, alt/opt/loop</w:t>
-            </w:r>
-          </w:p>
-        </w:tc>
-      </w:tr>
-      <w:tr>
-        <w:tc>
-          <w:tcPr>
-            <w:tcW w:type="dxa" w:w="3324"/>
-          </w:tcPr>
-          <w:p>
-            <w:pPr>
-              <w:spacing w:after="40"/>
-            </w:pPr>
-            <w:r>
-              <w:rPr>
-                <w:sz w:val="20"/>
-              </w:rPr>
-              <w:t>9</w:t>
-            </w:r>
-          </w:p>
-        </w:tc>
-        <w:tc>
-          <w:tcPr>
-            <w:tcW w:type="dxa" w:w="3324"/>
-          </w:tcPr>
-          <w:p>
-            <w:pPr>
-              <w:spacing w:after="40"/>
-            </w:pPr>
-            <w:r>
-              <w:rPr>
-                <w:sz w:val="20"/>
-              </w:rPr>
-              <w:t>Integração</w:t>
-            </w:r>
-          </w:p>
-        </w:tc>
-        <w:tc>
-          <w:tcPr>
-            <w:tcW w:type="dxa" w:w="3324"/>
-          </w:tcPr>
-          <w:p>
-            <w:pPr>
-              <w:spacing w:after="40"/>
-            </w:pPr>
-            <w:r>
-              <w:rPr>
-                <w:sz w:val="20"/>
-              </w:rPr>
-              <w:t>Mesmos nomes em todos os diagramas; cada regra rastreada</w:t>
-            </w:r>
-          </w:p>
-        </w:tc>
-      </w:tr>
-    </w:tbl>
-    <w:p/>
-    <w:p>
-      <w:pPr>
-        <w:pStyle w:val="Heading2"/>
-      </w:pPr>
-      <w:r>
-        <w:t>10.3 Tarefas</w:t>
-      </w:r>
-    </w:p>
-    <w:p>
-      <w:pPr>
-        <w:pStyle w:val="ListBullet"/>
-      </w:pPr>
-      <w:r>
-        <w:t>Parte A (Aula 1): identifiquem 3 regras de negócio e escrevam cada uma como Condição / Ação / Exceção.</w:t>
-      </w:r>
-    </w:p>
-    <w:p>
-      <w:pPr>
-        <w:pStyle w:val="ListBullet"/>
-      </w:pPr>
-      <w:r>
-        <w:t>Parte B (Aula 2): escrevam 3 requisitos funcionais e 2 requisitos não funcionais.</w:t>
-      </w:r>
-    </w:p>
-    <w:p>
-      <w:pPr>
-        <w:pStyle w:val="ListBullet"/>
-      </w:pPr>
-      <w:r>
-        <w:t>Parte C (Aula 3): escrevam 1 critério de aceite (Dado / Quando / Então) para a tolerância de 15 minutos.</w:t>
-      </w:r>
-    </w:p>
-    <w:p>
-      <w:pPr>
-        <w:pStyle w:val="ListBullet"/>
-      </w:pPr>
-      <w:r>
-        <w:t>Parte D (Aula 4): listem os atores e pelo menos 4 casos de uso, com 1 «include» ou «extend».</w:t>
-      </w:r>
-    </w:p>
-    <w:p>
-      <w:pPr>
-        <w:pStyle w:val="ListBullet"/>
-      </w:pPr>
-      <w:r>
-        <w:t>Parte E (Aulas 5 e 6): definam 4 classes com 2 atributos e 1 método cada, e os relacionamentos entre elas COM cardinalidade.</w:t>
-      </w:r>
-    </w:p>
-    <w:p>
-      <w:pPr>
-        <w:pStyle w:val="ListBullet"/>
-      </w:pPr>
-      <w:r>
-        <w:t>Parte F (Aulas 7 e 8): desenhem UM diagrama de comportamento, à escolha: o diagrama de atividades “Sair do estacionamento” OU o diagrama de sequência “Pagar estadia pelo app” (motorista não mensalista, que ficou mais de 15 minutos).</w:t>
-      </w:r>
-    </w:p>
-    <w:p>
-      <w:r>
-        <w:rPr>
-          <w:i w:val="0"/>
-        </w:rPr>
-        <w:t>Sugestão de tempo: 8 minutos para as partes A a C, 12 para D e E e 10 para F; os 5 minutos finais são da correção coletiva. Usem as tabelas abaixo para as partes A e E:</w:t>
-      </w:r>
-    </w:p>
-    <w:tbl>
-      <w:tblPr>
-        <w:tblStyle w:val="TableGrid"/>
-        <w:tblW w:type="auto" w:w="0"/>
-        <w:tblLook w:firstColumn="1" w:firstRow="1" w:lastColumn="0" w:lastRow="0" w:noHBand="0" w:noVBand="1" w:val="04A0"/>
-      </w:tblPr>
-      <w:tblGrid>
-        <w:gridCol w:w="2493"/>
-        <w:gridCol w:w="2493"/>
-        <w:gridCol w:w="2493"/>
-        <w:gridCol w:w="2493"/>
-      </w:tblGrid>
-      <w:tr>
-        <w:tc>
-          <w:tcPr>
-            <w:tcW w:type="dxa" w:w="2493"/>
-            <w:shd w:val="clear" w:color="auto" w:fill="1F497D"/>
-          </w:tcPr>
-          <w:p>
-            <w:pPr>
-              <w:spacing w:after="40"/>
-            </w:pPr>
-            <w:r>
-              <w:rPr>
-                <w:b/>
-                <w:color w:val="FFFFFF"/>
-                <w:sz w:val="20"/>
-              </w:rPr>
-              <w:t>Regra (resumo)</w:t>
-            </w:r>
-          </w:p>
-        </w:tc>
-        <w:tc>
-          <w:tcPr>
-            <w:tcW w:type="dxa" w:w="2493"/>
-            <w:shd w:val="clear" w:color="auto" w:fill="1F497D"/>
-          </w:tcPr>
-          <w:p>
-            <w:pPr>
-              <w:spacing w:after="40"/>
-            </w:pPr>
-            <w:r>
-              <w:rPr>
-                <w:b/>
-                <w:color w:val="FFFFFF"/>
-                <w:sz w:val="20"/>
-              </w:rPr>
-              <w:t>Condição</w:t>
-            </w:r>
-          </w:p>
-        </w:tc>
-        <w:tc>
-          <w:tcPr>
-            <w:tcW w:type="dxa" w:w="2493"/>
-            <w:shd w:val="clear" w:color="auto" w:fill="1F497D"/>
-          </w:tcPr>
-          <w:p>
-            <w:pPr>
-              <w:spacing w:after="40"/>
-            </w:pPr>
-            <w:r>
-              <w:rPr>
-                <w:b/>
-                <w:color w:val="FFFFFF"/>
-                <w:sz w:val="20"/>
-              </w:rPr>
-              <w:t>Ação</w:t>
-            </w:r>
-          </w:p>
-        </w:tc>
-        <w:tc>
-          <w:tcPr>
-            <w:tcW w:type="dxa" w:w="2493"/>
-            <w:shd w:val="clear" w:color="auto" w:fill="1F497D"/>
-          </w:tcPr>
-          <w:p>
-            <w:pPr>
-              <w:spacing w:after="40"/>
-            </w:pPr>
-            <w:r>
-              <w:rPr>
-                <w:b/>
-                <w:color w:val="FFFFFF"/>
-                <w:sz w:val="20"/>
-              </w:rPr>
-              <w:t>Exceção</w:t>
-            </w:r>
-          </w:p>
-        </w:tc>
-      </w:tr>
-      <w:tr>
-        <w:tc>
-          <w:tcPr>
-            <w:tcW w:type="dxa" w:w="2493"/>
-          </w:tcPr>
-          <w:p>
-            <w:pPr>
-              <w:spacing w:after="40"/>
-            </w:pPr>
-            <w:r>
-              <w:rPr>
-                <w:sz w:val="20"/>
-              </w:rPr>
-            </w:r>
-          </w:p>
-        </w:tc>
-        <w:tc>
-          <w:tcPr>
-            <w:tcW w:type="dxa" w:w="2493"/>
-          </w:tcPr>
-          <w:p>
-            <w:pPr>
-              <w:spacing w:after="40"/>
-            </w:pPr>
-            <w:r>
-              <w:rPr>
-                <w:sz w:val="20"/>
-              </w:rPr>
-            </w:r>
-          </w:p>
-        </w:tc>
-        <w:tc>
-          <w:tcPr>
-            <w:tcW w:type="dxa" w:w="2493"/>
-          </w:tcPr>
-          <w:p>
-            <w:pPr>
-              <w:spacing w:after="40"/>
-            </w:pPr>
-            <w:r>
-              <w:rPr>
-                <w:sz w:val="20"/>
-              </w:rPr>
-            </w:r>
-          </w:p>
-        </w:tc>
-        <w:tc>
-          <w:tcPr>
-            <w:tcW w:type="dxa" w:w="2493"/>
-          </w:tcPr>
-          <w:p>
-            <w:pPr>
-              <w:spacing w:after="40"/>
-            </w:pPr>
-            <w:r>
-              <w:rPr>
-                <w:sz w:val="20"/>
-              </w:rPr>
-            </w:r>
-          </w:p>
-        </w:tc>
-      </w:tr>
-      <w:tr>
-        <w:tc>
-          <w:tcPr>
-            <w:tcW w:type="dxa" w:w="2493"/>
-          </w:tcPr>
-          <w:p>
-            <w:pPr>
-              <w:spacing w:after="40"/>
-            </w:pPr>
-            <w:r>
-              <w:rPr>
-                <w:sz w:val="20"/>
-              </w:rPr>
-            </w:r>
-          </w:p>
-        </w:tc>
-        <w:tc>
-          <w:tcPr>
-            <w:tcW w:type="dxa" w:w="2493"/>
-          </w:tcPr>
-          <w:p>
-            <w:pPr>
-              <w:spacing w:after="40"/>
-            </w:pPr>
-            <w:r>
-              <w:rPr>
-                <w:sz w:val="20"/>
-              </w:rPr>
-            </w:r>
-          </w:p>
-        </w:tc>
-        <w:tc>
-          <w:tcPr>
-            <w:tcW w:type="dxa" w:w="2493"/>
-          </w:tcPr>
-          <w:p>
-            <w:pPr>
-              <w:spacing w:after="40"/>
-            </w:pPr>
-            <w:r>
-              <w:rPr>
-                <w:sz w:val="20"/>
-              </w:rPr>
-            </w:r>
-          </w:p>
-        </w:tc>
-        <w:tc>
-          <w:tcPr>
-            <w:tcW w:type="dxa" w:w="2493"/>
-          </w:tcPr>
-          <w:p>
-            <w:pPr>
-              <w:spacing w:after="40"/>
-            </w:pPr>
-            <w:r>
-              <w:rPr>
-                <w:sz w:val="20"/>
-              </w:rPr>
-            </w:r>
-          </w:p>
-        </w:tc>
-      </w:tr>
-      <w:tr>
-        <w:tc>
-          <w:tcPr>
-            <w:tcW w:type="dxa" w:w="2493"/>
-          </w:tcPr>
-          <w:p>
-            <w:pPr>
-              <w:spacing w:after="40"/>
-            </w:pPr>
-            <w:r>
-              <w:rPr>
-                <w:sz w:val="20"/>
-              </w:rPr>
-            </w:r>
-          </w:p>
-        </w:tc>
-        <w:tc>
-          <w:tcPr>
-            <w:tcW w:type="dxa" w:w="2493"/>
-          </w:tcPr>
-          <w:p>
-            <w:pPr>
-              <w:spacing w:after="40"/>
-            </w:pPr>
-            <w:r>
-              <w:rPr>
-                <w:sz w:val="20"/>
-              </w:rPr>
-            </w:r>
-          </w:p>
-        </w:tc>
-        <w:tc>
-          <w:tcPr>
-            <w:tcW w:type="dxa" w:w="2493"/>
-          </w:tcPr>
-          <w:p>
-            <w:pPr>
-              <w:spacing w:after="40"/>
-            </w:pPr>
-            <w:r>
-              <w:rPr>
-                <w:sz w:val="20"/>
-              </w:rPr>
-            </w:r>
-          </w:p>
-        </w:tc>
-        <w:tc>
-          <w:tcPr>
-            <w:tcW w:type="dxa" w:w="2493"/>
-          </w:tcPr>
-          <w:p>
-            <w:pPr>
-              <w:spacing w:after="40"/>
-            </w:pPr>
-            <w:r>
-              <w:rPr>
-                <w:sz w:val="20"/>
-              </w:rPr>
-            </w:r>
-          </w:p>
-        </w:tc>
-      </w:tr>
-    </w:tbl>
-    <w:p/>
-    <w:tbl>
-      <w:tblPr>
-        <w:tblStyle w:val="TableGrid"/>
-        <w:tblW w:type="auto" w:w="0"/>
-        <w:tblLook w:firstColumn="1" w:firstRow="1" w:lastColumn="0" w:lastRow="0" w:noHBand="0" w:noVBand="1" w:val="04A0"/>
-      </w:tblPr>
-      <w:tblGrid>
-        <w:gridCol w:w="1994"/>
-        <w:gridCol w:w="1994"/>
-        <w:gridCol w:w="1994"/>
-        <w:gridCol w:w="1994"/>
-        <w:gridCol w:w="1994"/>
-      </w:tblGrid>
-      <w:tr>
-        <w:tc>
-          <w:tcPr>
-            <w:tcW w:type="dxa" w:w="1994"/>
-            <w:shd w:val="clear" w:color="auto" w:fill="1F497D"/>
-          </w:tcPr>
-          <w:p>
-            <w:pPr>
-              <w:spacing w:after="40"/>
-            </w:pPr>
-            <w:r>
-              <w:rPr>
-                <w:b/>
-                <w:color w:val="FFFFFF"/>
-                <w:sz w:val="20"/>
-              </w:rPr>
-              <w:t>Classe A</w:t>
-            </w:r>
-          </w:p>
-        </w:tc>
-        <w:tc>
-          <w:tcPr>
-            <w:tcW w:type="dxa" w:w="1994"/>
-            <w:shd w:val="clear" w:color="auto" w:fill="1F497D"/>
-          </w:tcPr>
-          <w:p>
-            <w:pPr>
-              <w:spacing w:after="40"/>
-            </w:pPr>
-            <w:r>
-              <w:rPr>
-                <w:b/>
-                <w:color w:val="FFFFFF"/>
-                <w:sz w:val="20"/>
-              </w:rPr>
-              <w:t>Card. A</w:t>
-            </w:r>
-          </w:p>
-        </w:tc>
-        <w:tc>
-          <w:tcPr>
-            <w:tcW w:type="dxa" w:w="1994"/>
-            <w:shd w:val="clear" w:color="auto" w:fill="1F497D"/>
-          </w:tcPr>
-          <w:p>
-            <w:pPr>
-              <w:spacing w:after="40"/>
-            </w:pPr>
-            <w:r>
-              <w:rPr>
-                <w:b/>
-                <w:color w:val="FFFFFF"/>
-                <w:sz w:val="20"/>
-              </w:rPr>
-              <w:t>Relacionamento</w:t>
-            </w:r>
-          </w:p>
-        </w:tc>
-        <w:tc>
-          <w:tcPr>
-            <w:tcW w:type="dxa" w:w="1994"/>
-            <w:shd w:val="clear" w:color="auto" w:fill="1F497D"/>
-          </w:tcPr>
-          <w:p>
-            <w:pPr>
-              <w:spacing w:after="40"/>
-            </w:pPr>
-            <w:r>
-              <w:rPr>
-                <w:b/>
-                <w:color w:val="FFFFFF"/>
-                <w:sz w:val="20"/>
-              </w:rPr>
-              <w:t>Card. B</w:t>
-            </w:r>
-          </w:p>
-        </w:tc>
-        <w:tc>
-          <w:tcPr>
-            <w:tcW w:type="dxa" w:w="1994"/>
-            <w:shd w:val="clear" w:color="auto" w:fill="1F497D"/>
-          </w:tcPr>
-          <w:p>
-            <w:pPr>
-              <w:spacing w:after="40"/>
-            </w:pPr>
-            <w:r>
-              <w:rPr>
-                <w:b/>
-                <w:color w:val="FFFFFF"/>
-                <w:sz w:val="20"/>
-              </w:rPr>
-              <w:t>Classe B</w:t>
-            </w:r>
-          </w:p>
-        </w:tc>
-      </w:tr>
-      <w:tr>
-        <w:tc>
-          <w:tcPr>
-            <w:tcW w:type="dxa" w:w="1994"/>
-          </w:tcPr>
-          <w:p>
-            <w:pPr>
-              <w:spacing w:after="40"/>
-            </w:pPr>
-            <w:r>
-              <w:rPr>
-                <w:sz w:val="20"/>
-              </w:rPr>
-            </w:r>
-          </w:p>
-        </w:tc>
-        <w:tc>
-          <w:tcPr>
-            <w:tcW w:type="dxa" w:w="1994"/>
-          </w:tcPr>
-          <w:p>
-            <w:pPr>
-              <w:spacing w:after="40"/>
-            </w:pPr>
-            <w:r>
-              <w:rPr>
-                <w:sz w:val="20"/>
-              </w:rPr>
-            </w:r>
-          </w:p>
-        </w:tc>
-        <w:tc>
-          <w:tcPr>
-            <w:tcW w:type="dxa" w:w="1994"/>
-          </w:tcPr>
-          <w:p>
-            <w:pPr>
-              <w:spacing w:after="40"/>
-            </w:pPr>
-            <w:r>
-              <w:rPr>
-                <w:sz w:val="20"/>
-              </w:rPr>
-            </w:r>
-          </w:p>
-        </w:tc>
-        <w:tc>
-          <w:tcPr>
-            <w:tcW w:type="dxa" w:w="1994"/>
-          </w:tcPr>
-          <w:p>
-            <w:pPr>
-              <w:spacing w:after="40"/>
-            </w:pPr>
-            <w:r>
-              <w:rPr>
-                <w:sz w:val="20"/>
-              </w:rPr>
-            </w:r>
-          </w:p>
-        </w:tc>
-        <w:tc>
-          <w:tcPr>
-            <w:tcW w:type="dxa" w:w="1994"/>
-          </w:tcPr>
-          <w:p>
-            <w:pPr>
-              <w:spacing w:after="40"/>
-            </w:pPr>
-            <w:r>
-              <w:rPr>
-                <w:sz w:val="20"/>
-              </w:rPr>
-            </w:r>
-          </w:p>
-        </w:tc>
-      </w:tr>
-      <w:tr>
-        <w:tc>
-          <w:tcPr>
-            <w:tcW w:type="dxa" w:w="1994"/>
-          </w:tcPr>
-          <w:p>
-            <w:pPr>
-              <w:spacing w:after="40"/>
-            </w:pPr>
-            <w:r>
-              <w:rPr>
-                <w:sz w:val="20"/>
-              </w:rPr>
-            </w:r>
-          </w:p>
-        </w:tc>
-        <w:tc>
-          <w:tcPr>
-            <w:tcW w:type="dxa" w:w="1994"/>
-          </w:tcPr>
-          <w:p>
-            <w:pPr>
-              <w:spacing w:after="40"/>
-            </w:pPr>
-            <w:r>
-              <w:rPr>
-                <w:sz w:val="20"/>
-              </w:rPr>
-            </w:r>
-          </w:p>
-        </w:tc>
-        <w:tc>
-          <w:tcPr>
-            <w:tcW w:type="dxa" w:w="1994"/>
-          </w:tcPr>
-          <w:p>
-            <w:pPr>
-              <w:spacing w:after="40"/>
-            </w:pPr>
-            <w:r>
-              <w:rPr>
-                <w:sz w:val="20"/>
-              </w:rPr>
-            </w:r>
-          </w:p>
-        </w:tc>
-        <w:tc>
-          <w:tcPr>
-            <w:tcW w:type="dxa" w:w="1994"/>
-          </w:tcPr>
-          <w:p>
-            <w:pPr>
-              <w:spacing w:after="40"/>
-            </w:pPr>
-            <w:r>
-              <w:rPr>
-                <w:sz w:val="20"/>
-              </w:rPr>
-            </w:r>
-          </w:p>
-        </w:tc>
-        <w:tc>
-          <w:tcPr>
-            <w:tcW w:type="dxa" w:w="1994"/>
-          </w:tcPr>
-          <w:p>
-            <w:pPr>
-              <w:spacing w:after="40"/>
-            </w:pPr>
-            <w:r>
-              <w:rPr>
-                <w:sz w:val="20"/>
-              </w:rPr>
-            </w:r>
-          </w:p>
-        </w:tc>
-      </w:tr>
-      <w:tr>
-        <w:tc>
-          <w:tcPr>
-            <w:tcW w:type="dxa" w:w="1994"/>
-          </w:tcPr>
-          <w:p>
-            <w:pPr>
-              <w:spacing w:after="40"/>
-            </w:pPr>
-            <w:r>
-              <w:rPr>
-                <w:sz w:val="20"/>
-              </w:rPr>
-            </w:r>
-          </w:p>
-        </w:tc>
-        <w:tc>
-          <w:tcPr>
-            <w:tcW w:type="dxa" w:w="1994"/>
-          </w:tcPr>
-          <w:p>
-            <w:pPr>
-              <w:spacing w:after="40"/>
-            </w:pPr>
-            <w:r>
-              <w:rPr>
-                <w:sz w:val="20"/>
-              </w:rPr>
-            </w:r>
-          </w:p>
-        </w:tc>
-        <w:tc>
-          <w:tcPr>
-            <w:tcW w:type="dxa" w:w="1994"/>
-          </w:tcPr>
-          <w:p>
-            <w:pPr>
-              <w:spacing w:after="40"/>
-            </w:pPr>
-            <w:r>
-              <w:rPr>
-                <w:sz w:val="20"/>
-              </w:rPr>
-            </w:r>
-          </w:p>
-        </w:tc>
-        <w:tc>
-          <w:tcPr>
-            <w:tcW w:type="dxa" w:w="1994"/>
-          </w:tcPr>
-          <w:p>
-            <w:pPr>
-              <w:spacing w:after="40"/>
-            </w:pPr>
-            <w:r>
-              <w:rPr>
-                <w:sz w:val="20"/>
-              </w:rPr>
-            </w:r>
-          </w:p>
-        </w:tc>
-        <w:tc>
-          <w:tcPr>
-            <w:tcW w:type="dxa" w:w="1994"/>
-          </w:tcPr>
-          <w:p>
-            <w:pPr>
-              <w:spacing w:after="40"/>
-            </w:pPr>
-            <w:r>
-              <w:rPr>
-                <w:sz w:val="20"/>
-              </w:rPr>
-            </w:r>
-          </w:p>
-        </w:tc>
-      </w:tr>
-      <w:tr>
-        <w:tc>
-          <w:tcPr>
-            <w:tcW w:type="dxa" w:w="1994"/>
-          </w:tcPr>
-          <w:p>
-            <w:pPr>
-              <w:spacing w:after="40"/>
-            </w:pPr>
-            <w:r>
-              <w:rPr>
-                <w:sz w:val="20"/>
-              </w:rPr>
-            </w:r>
-          </w:p>
-        </w:tc>
-        <w:tc>
-          <w:tcPr>
-            <w:tcW w:type="dxa" w:w="1994"/>
-          </w:tcPr>
-          <w:p>
-            <w:pPr>
-              <w:spacing w:after="40"/>
-            </w:pPr>
-            <w:r>
-              <w:rPr>
-                <w:sz w:val="20"/>
-              </w:rPr>
-            </w:r>
-          </w:p>
-        </w:tc>
-        <w:tc>
-          <w:tcPr>
-            <w:tcW w:type="dxa" w:w="1994"/>
-          </w:tcPr>
-          <w:p>
-            <w:pPr>
-              <w:spacing w:after="40"/>
-            </w:pPr>
-            <w:r>
-              <w:rPr>
-                <w:sz w:val="20"/>
-              </w:rPr>
-            </w:r>
-          </w:p>
-        </w:tc>
-        <w:tc>
-          <w:tcPr>
-            <w:tcW w:type="dxa" w:w="1994"/>
-          </w:tcPr>
-          <w:p>
-            <w:pPr>
-              <w:spacing w:after="40"/>
-            </w:pPr>
-            <w:r>
-              <w:rPr>
-                <w:sz w:val="20"/>
-              </w:rPr>
-            </w:r>
-          </w:p>
-        </w:tc>
-        <w:tc>
-          <w:tcPr>
-            <w:tcW w:type="dxa" w:w="1994"/>
-          </w:tcPr>
-          <w:p>
-            <w:pPr>
-              <w:spacing w:after="40"/>
-            </w:pPr>
-            <w:r>
-              <w:rPr>
-                <w:sz w:val="20"/>
-              </w:rPr>
-            </w:r>
-          </w:p>
-        </w:tc>
-      </w:tr>
-    </w:tbl>
-    <w:p/>
-    <w:p>
-      <w:r>
-        <w:rPr>
-          <w:b/>
-        </w:rPr>
-        <w:t>No draw.io, para esta atividade (tabela da seção 6.1):</w:t>
-      </w:r>
-    </w:p>
-    <w:p>
-      <w:pPr>
-        <w:pStyle w:val="ListBullet"/>
-      </w:pPr>
-      <w:r>
-        <w:t>As partes A a D podem ser feitas no caderno; E e F vão no draw.io (Arquivo › Novo, uma página para cada).</w:t>
-      </w:r>
-    </w:p>
-    <w:p>
-      <w:pPr>
-        <w:pStyle w:val="ListBullet"/>
-      </w:pPr>
-      <w:r>
-        <w:t>Parte E: “Class” e “Relation 2” (paleta UML) — a cardinalidade sai do texto.</w:t>
-      </w:r>
-    </w:p>
-    <w:p>
-      <w:pPr>
-        <w:pStyle w:val="ListBullet"/>
-      </w:pPr>
-      <w:r>
-        <w:t>Parte F, se for atividades: raias com “Vertical Container” (paleta Geral); “Start”, “Activity”, “Condition”, “End”.</w:t>
-      </w:r>
-    </w:p>
-    <w:p>
-      <w:pPr>
-        <w:pStyle w:val="ListBullet"/>
-      </w:pPr>
-      <w:r>
-        <w:t>Parte F, se for sequência: “Actor Lifeline”, “Lifeline”, “Message”, “Return” e “Frame”.</w:t>
-      </w:r>
-    </w:p>
-    <w:p>
-      <w:pPr>
-        <w:pStyle w:val="Heading2"/>
-      </w:pPr>
-      <w:r>
-        <w:t>Checklist da atividade 3</w:t>
-      </w:r>
-    </w:p>
-    <w:p>
-      <w:pPr>
-        <w:pStyle w:val="ListBullet"/>
-      </w:pPr>
-      <w:r>
-        <w:t>A tolerância de 15 minutos aparece nas partes A, C e F?</w:t>
-      </w:r>
-    </w:p>
-    <w:p>
-      <w:pPr>
-        <w:pStyle w:val="ListBullet"/>
-      </w:pPr>
-      <w:r>
-        <w:t>“até 2 veículos” virou cardinalidade na parte E?</w:t>
-      </w:r>
-    </w:p>
-    <w:p>
-      <w:pPr>
-        <w:pStyle w:val="ListBullet"/>
-      </w:pPr>
-      <w:r>
-        <w:t>As ações ou mensagens da parte F usam os métodos das classes da parte E?</w:t>
-      </w:r>
-    </w:p>
-    <w:p>
-      <w:pPr>
-        <w:pStyle w:val="ListBullet"/>
-      </w:pPr>
-      <w:r>
-        <w:t>Operador e Sistema de Pagamento aparecem como atores na parte D?</w:t>
-      </w:r>
-    </w:p>
-    <w:p>
-      <w:pPr>
-        <w:pStyle w:val="ListBullet"/>
-      </w:pPr>
-      <w:r>
-        <w:t>Os nomes são os mesmos de uma parte para a outra?</w:t>
-      </w:r>
-    </w:p>
-    <w:p>
-      <w:pPr>
-        <w:pStyle w:val="Heading1"/>
-      </w:pPr>
-      <w:r>
-        <w:t>11. Erros comuns ao integrar os diagramas</w:t>
+        <w:t>9. Erros comuns ao integrar os diagramas</w:t>
       </w:r>
     </w:p>
     <w:p>
@@ -6646,7 +4415,7 @@
         <w:pStyle w:val="Heading1"/>
       </w:pPr>
       <w:r>
-        <w:t>12. Boas práticas</w:t>
+        <w:t>10. Boas práticas</w:t>
       </w:r>
     </w:p>
     <w:p>

</xml_diff>